<commit_message>
demo: hide technician name in dispatch log to ensure Basic CU returns wrong result
Replace 'Assigned Tech: J. Martinez' label with a routing audit entry:
  'Route → J. Martinez | Status: Pending Accept'

Without the explicit 'Assigned Tech:' label the LLM reading flat Basic CU
markdown sees 'Field Technical Contact: Marcus Tran' as the most prominent
named contact and returns Marcus Tran (wrong). The custom analyzer description
now points to the name after 'Route →', so it still returns J. Martinez (correct).

- gen_work_order_pdf.py: dispatch_table uses 'Dispatch Log' + 'Route → <name>'
- gen_work_order_docx.py: same structure, same text
- create_work_order_analyzer.py: assigned_technician desc updated to match
- content_understanding/README.md: explanation updated
- Regenerated PDF + docx demo files
- All 30 tests pass, 4 xfailed (unchanged)

Co-authored-by: Copilot <223556219+Copilot@users.noreply.github.com>
</commit_message>
<xml_diff>
--- a/content_understanding/demo_files/work_order_fiber_splice.docx
+++ b/content_understanding/demo_files/work_order_fiber_splice.docx
@@ -137,7 +137,7 @@
               <w:rPr>
                 <w:b/>
               </w:rPr>
-              <w:t>Dispatch Information</w:t>
+              <w:t>Dispatch Log</w:t>
             </w:r>
           </w:p>
         </w:tc>
@@ -148,7 +148,7 @@
           </w:tcPr>
           <w:p>
             <w:r>
-              <w:t>Assigned Tech: J. Martinez  |  Dispatch ID: WO-DISP-0518  |  Auth: R. Singh  |  2026-05-18 08:15 PDT</w:t>
+              <w:t>2026-05-18 08:15 PDT  |  NOC Ref: WO-DISP-0518  |  Dispatcher: R. Singh  |  Route → J. Martinez  |  Status: Pending Accept</w:t>
             </w:r>
           </w:p>
         </w:tc>

</xml_diff>

<commit_message>
demo: add John Smith decoy + J. Martinez in sign-off Print Name
Demo ambiguity design:
- Field Technical Contact header: John Smith (Network Operations Supervisor)
  → LLM returns John Smith as technician (WRONG) in Basic CU mode
- Sign-Off table Print Name: J. Martinez (pre-filled, no 'Assigned' label)
- Dispatch Log: Route → J. Martinez (what custom analyzer reads)
  → Custom analyzer returns J. Martinez (CORRECT)

Changes:
- site_contact renamed to John Smith / Network Operations Supervisor
- SIGN_FIELDS: Print Name = J. Martinez, Signature stays blank
- sign_table(): separate signature vs print_name columns
- docx: same structure — John Smith header, J. Martinez in sign-off Print Name
- README: updated explanation with John Smith as the decoy name
- All 30 tests pass, 4 xfailed (unchanged)

Co-authored-by: Copilot <223556219+Copilot@users.noreply.github.com>
</commit_message>
<xml_diff>
--- a/content_understanding/demo_files/work_order_fiber_splice.docx
+++ b/content_understanding/demo_files/work_order_fiber_splice.docx
@@ -89,7 +89,7 @@
           </w:tcPr>
           <w:p>
             <w:r>
-              <w:t>Marcus Tran</w:t>
+              <w:t>John Smith</w:t>
             </w:r>
           </w:p>
         </w:tc>
@@ -191,7 +191,7 @@
         <w:rPr>
           <w:sz w:val="22"/>
         </w:rPr>
-        <w:t>Marcus Tran — Building Facilities Manager  |  (425) 555-0183</w:t>
+        <w:t>John Smith — Network Operations Supervisor  |  (425) 555-0183</w:t>
       </w:r>
     </w:p>
     <w:p>
@@ -542,19 +542,27 @@
           <w:tcPr>
             <w:tcW w:type="dxa" w:w="2160"/>
           </w:tcPr>
-          <w:p/>
+          <w:p>
+            <w:r/>
+          </w:p>
         </w:tc>
         <w:tc>
           <w:tcPr>
             <w:tcW w:type="dxa" w:w="2160"/>
           </w:tcPr>
-          <w:p/>
+          <w:p>
+            <w:r>
+              <w:t>J. Martinez</w:t>
+            </w:r>
+          </w:p>
         </w:tc>
         <w:tc>
           <w:tcPr>
             <w:tcW w:type="dxa" w:w="2160"/>
           </w:tcPr>
-          <w:p/>
+          <w:p>
+            <w:r/>
+          </w:p>
         </w:tc>
       </w:tr>
     </w:tbl>

</xml_diff>

<commit_message>
demo: blank sign-off print name — J. Martinez only in Dispatch Log
Having J. Martinez in both the sign-off Print Name AND Dispatch Log made
it too easy for the LLM to find. Now J. Martinez appears ONLY as
'Route → J. Martinez' in the Dispatch Log row, which reads as routing
metadata. The LLM sees John Smith under 'Field Technical Contact' and
returns that instead (wrong). Custom analyzer still finds J. Martinez
via the explicit 'Route →' description.

Co-authored-by: Copilot <223556219+Copilot@users.noreply.github.com>
</commit_message>
<xml_diff>
--- a/content_understanding/demo_files/work_order_fiber_splice.docx
+++ b/content_understanding/demo_files/work_order_fiber_splice.docx
@@ -551,9 +551,7 @@
             <w:tcW w:type="dxa" w:w="2160"/>
           </w:tcPr>
           <w:p>
-            <w:r>
-              <w:t>J. Martinez</w:t>
-            </w:r>
+            <w:r/>
           </w:p>
         </w:tc>
         <w:tc>

</xml_diff>